<commit_message>
Niveles: el boletín de 06:00 del 31-oct venía fechado '01 de noviembre' (error de CONAGUA) y bloqueaba los informes de 08:00 y 10:00
fuente2_niveles: un corte no puede ser posterior al correo que lo trae; se usa la fecha del correo. Se re-fechan los 15 registros
a 2026-10-31 06:00 y se regeneran los productos derivados.

Co-Authored-By: Claude Opus 5.5 <noreply@anthropic.com>
Claude-Session: https://claude.ai/code/session_01KiUHta8j3inixRRdckDj4F
</commit_message>
<xml_diff>
--- a/data/niveles/Reportes/Reporte_Niveles_Hidrometricos_Ultimo.docx
+++ b/data/niveles/Reportes/Reporte_Niveles_Hidrometricos_Ultimo.docx
@@ -26,7 +26,7 @@
           <w:color w:val="2D2D2D"/>
           <w:sz w:val="19"/>
         </w:rPr>
-        <w:t>Corte: 01/11/2026 06:00 h | Ciclo operativo 06:00–06:00</w:t>
+        <w:t>Corte: 31/10/2026 06:00 h | Ciclo operativo 06:00–06:00</w:t>
       </w:r>
     </w:p>
     <w:p>
@@ -378,7 +378,7 @@
                 <w:b w:val="0"/>
                 <w:sz w:val="13"/>
               </w:rPr>
-              <w:t>2026-11-01T06:00:00-06:00</w:t>
+              <w:t>2026-10-31T06:00:00-06:00</w:t>
             </w:r>
           </w:p>
         </w:tc>
@@ -530,7 +530,7 @@
                 <w:b w:val="0"/>
                 <w:sz w:val="13"/>
               </w:rPr>
-              <w:t>2026-11-01T06:00:00-06:00</w:t>
+              <w:t>2026-10-31T06:00:00-06:00</w:t>
             </w:r>
           </w:p>
         </w:tc>
@@ -682,7 +682,7 @@
                 <w:b w:val="0"/>
                 <w:sz w:val="13"/>
               </w:rPr>
-              <w:t>2026-11-01T06:00:00-06:00</w:t>
+              <w:t>2026-10-31T06:00:00-06:00</w:t>
             </w:r>
           </w:p>
         </w:tc>
@@ -834,7 +834,7 @@
                 <w:b w:val="0"/>
                 <w:sz w:val="13"/>
               </w:rPr>
-              <w:t>2026-11-01T06:00:00-06:00</w:t>
+              <w:t>2026-10-31T06:00:00-06:00</w:t>
             </w:r>
           </w:p>
         </w:tc>
@@ -986,7 +986,7 @@
                 <w:b w:val="0"/>
                 <w:sz w:val="13"/>
               </w:rPr>
-              <w:t>2026-11-01T06:00:00-06:00</w:t>
+              <w:t>2026-10-31T06:00:00-06:00</w:t>
             </w:r>
           </w:p>
         </w:tc>
@@ -1138,7 +1138,7 @@
                 <w:b w:val="0"/>
                 <w:sz w:val="13"/>
               </w:rPr>
-              <w:t>2026-11-01T06:00:00-06:00</w:t>
+              <w:t>2026-10-31T06:00:00-06:00</w:t>
             </w:r>
           </w:p>
         </w:tc>
@@ -1290,7 +1290,7 @@
                 <w:b w:val="0"/>
                 <w:sz w:val="13"/>
               </w:rPr>
-              <w:t>2026-11-01T06:00:00-06:00</w:t>
+              <w:t>2026-10-31T06:00:00-06:00</w:t>
             </w:r>
           </w:p>
         </w:tc>
@@ -1442,7 +1442,7 @@
                 <w:b w:val="0"/>
                 <w:sz w:val="13"/>
               </w:rPr>
-              <w:t>2026-11-01T06:00:00-06:00</w:t>
+              <w:t>2026-10-31T06:00:00-06:00</w:t>
             </w:r>
           </w:p>
         </w:tc>
@@ -1594,7 +1594,7 @@
                 <w:b w:val="0"/>
                 <w:sz w:val="13"/>
               </w:rPr>
-              <w:t>2026-11-01T06:00:00-06:00</w:t>
+              <w:t>2026-10-31T06:00:00-06:00</w:t>
             </w:r>
           </w:p>
         </w:tc>
@@ -1746,7 +1746,7 @@
                 <w:b w:val="0"/>
                 <w:sz w:val="13"/>
               </w:rPr>
-              <w:t>2026-11-01T06:00:00-06:00</w:t>
+              <w:t>2026-10-31T06:00:00-06:00</w:t>
             </w:r>
           </w:p>
         </w:tc>
@@ -1898,7 +1898,7 @@
                 <w:b w:val="0"/>
                 <w:sz w:val="13"/>
               </w:rPr>
-              <w:t>2026-11-01T06:00:00-06:00</w:t>
+              <w:t>2026-10-31T06:00:00-06:00</w:t>
             </w:r>
           </w:p>
         </w:tc>
@@ -2050,7 +2050,7 @@
                 <w:b w:val="0"/>
                 <w:sz w:val="13"/>
               </w:rPr>
-              <w:t>2026-11-01T06:00:00-06:00</w:t>
+              <w:t>2026-10-31T06:00:00-06:00</w:t>
             </w:r>
           </w:p>
         </w:tc>
@@ -2202,7 +2202,7 @@
                 <w:b w:val="0"/>
                 <w:sz w:val="13"/>
               </w:rPr>
-              <w:t>2026-11-01T06:00:00-06:00</w:t>
+              <w:t>2026-10-31T06:00:00-06:00</w:t>
             </w:r>
           </w:p>
         </w:tc>
@@ -2354,7 +2354,7 @@
                 <w:b w:val="0"/>
                 <w:sz w:val="13"/>
               </w:rPr>
-              <w:t>2026-11-01T06:00:00-06:00</w:t>
+              <w:t>2026-10-31T06:00:00-06:00</w:t>
             </w:r>
           </w:p>
         </w:tc>
@@ -2506,7 +2506,7 @@
                 <w:b w:val="0"/>
                 <w:sz w:val="13"/>
               </w:rPr>
-              <w:t>2026-11-01T06:00:00-06:00</w:t>
+              <w:t>2026-10-31T06:00:00-06:00</w:t>
             </w:r>
           </w:p>
         </w:tc>
@@ -2689,21 +2689,6 @@
                 <w:b w:val="0"/>
                 <w:sz w:val="14"/>
               </w:rPr>
-              <w:t>s/d</w:t>
-            </w:r>
-          </w:p>
-        </w:tc>
-        <w:tc>
-          <w:tcPr>
-            <w:tcW w:type="dxa" w:w="1818"/>
-          </w:tcPr>
-          <w:p>
-            <w:r>
-              <w:rPr>
-                <w:rFonts w:ascii="Arial" w:hAnsi="Arial"/>
-                <w:b w:val="0"/>
-                <w:sz w:val="14"/>
-              </w:rPr>
               <w:t>-0.02</w:t>
             </w:r>
           </w:p>
@@ -2720,6 +2705,21 @@
                 <w:sz w:val="14"/>
               </w:rPr>
               <w:t>-0.10</w:t>
+            </w:r>
+          </w:p>
+        </w:tc>
+        <w:tc>
+          <w:tcPr>
+            <w:tcW w:type="dxa" w:w="1818"/>
+          </w:tcPr>
+          <w:p>
+            <w:r>
+              <w:rPr>
+                <w:rFonts w:ascii="Arial" w:hAnsi="Arial"/>
+                <w:b w:val="0"/>
+                <w:sz w:val="14"/>
+              </w:rPr>
+              <w:t>-0.14</w:t>
             </w:r>
           </w:p>
         </w:tc>
@@ -2764,7 +2764,7 @@
                 <w:b w:val="0"/>
                 <w:sz w:val="14"/>
               </w:rPr>
-              <w:t>2026-11-01T06:00:00-06:00</w:t>
+              <w:t>2026-10-31T06:00:00-06:00</w:t>
             </w:r>
           </w:p>
         </w:tc>
@@ -2811,21 +2811,6 @@
                 <w:b w:val="0"/>
                 <w:sz w:val="14"/>
               </w:rPr>
-              <w:t>s/d</w:t>
-            </w:r>
-          </w:p>
-        </w:tc>
-        <w:tc>
-          <w:tcPr>
-            <w:tcW w:type="dxa" w:w="1818"/>
-          </w:tcPr>
-          <w:p>
-            <w:r>
-              <w:rPr>
-                <w:rFonts w:ascii="Arial" w:hAnsi="Arial"/>
-                <w:b w:val="0"/>
-                <w:sz w:val="14"/>
-              </w:rPr>
               <w:t>-0.09</w:t>
             </w:r>
           </w:p>
@@ -2842,6 +2827,21 @@
                 <w:sz w:val="14"/>
               </w:rPr>
               <w:t>-0.11</w:t>
+            </w:r>
+          </w:p>
+        </w:tc>
+        <w:tc>
+          <w:tcPr>
+            <w:tcW w:type="dxa" w:w="1818"/>
+          </w:tcPr>
+          <w:p>
+            <w:r>
+              <w:rPr>
+                <w:rFonts w:ascii="Arial" w:hAnsi="Arial"/>
+                <w:b w:val="0"/>
+                <w:sz w:val="14"/>
+              </w:rPr>
+              <w:t>-0.12</w:t>
             </w:r>
           </w:p>
         </w:tc>
@@ -2886,7 +2886,7 @@
                 <w:b w:val="0"/>
                 <w:sz w:val="14"/>
               </w:rPr>
-              <w:t>2026-11-01T06:00:00-06:00</w:t>
+              <w:t>2026-10-31T06:00:00-06:00</w:t>
             </w:r>
           </w:p>
         </w:tc>
@@ -2933,21 +2933,6 @@
                 <w:b w:val="0"/>
                 <w:sz w:val="14"/>
               </w:rPr>
-              <w:t>s/d</w:t>
-            </w:r>
-          </w:p>
-        </w:tc>
-        <w:tc>
-          <w:tcPr>
-            <w:tcW w:type="dxa" w:w="1818"/>
-          </w:tcPr>
-          <w:p>
-            <w:r>
-              <w:rPr>
-                <w:rFonts w:ascii="Arial" w:hAnsi="Arial"/>
-                <w:b w:val="0"/>
-                <w:sz w:val="14"/>
-              </w:rPr>
               <w:t>-0.04</w:t>
             </w:r>
           </w:p>
@@ -2964,6 +2949,21 @@
                 <w:sz w:val="14"/>
               </w:rPr>
               <w:t>-0.07</w:t>
+            </w:r>
+          </w:p>
+        </w:tc>
+        <w:tc>
+          <w:tcPr>
+            <w:tcW w:type="dxa" w:w="1818"/>
+          </w:tcPr>
+          <w:p>
+            <w:r>
+              <w:rPr>
+                <w:rFonts w:ascii="Arial" w:hAnsi="Arial"/>
+                <w:b w:val="0"/>
+                <w:sz w:val="14"/>
+              </w:rPr>
+              <w:t>-0.12</w:t>
             </w:r>
           </w:p>
         </w:tc>
@@ -3008,7 +3008,7 @@
                 <w:b w:val="0"/>
                 <w:sz w:val="14"/>
               </w:rPr>
-              <w:t>2026-11-01T06:00:00-06:00</w:t>
+              <w:t>2026-10-31T06:00:00-06:00</w:t>
             </w:r>
           </w:p>
         </w:tc>
@@ -3055,21 +3055,6 @@
                 <w:b w:val="0"/>
                 <w:sz w:val="14"/>
               </w:rPr>
-              <w:t>s/d</w:t>
-            </w:r>
-          </w:p>
-        </w:tc>
-        <w:tc>
-          <w:tcPr>
-            <w:tcW w:type="dxa" w:w="1818"/>
-          </w:tcPr>
-          <w:p>
-            <w:r>
-              <w:rPr>
-                <w:rFonts w:ascii="Arial" w:hAnsi="Arial"/>
-                <w:b w:val="0"/>
-                <w:sz w:val="14"/>
-              </w:rPr>
               <w:t>-0.05</w:t>
             </w:r>
           </w:p>
@@ -3086,6 +3071,21 @@
                 <w:sz w:val="14"/>
               </w:rPr>
               <w:t>-0.12</w:t>
+            </w:r>
+          </w:p>
+        </w:tc>
+        <w:tc>
+          <w:tcPr>
+            <w:tcW w:type="dxa" w:w="1818"/>
+          </w:tcPr>
+          <w:p>
+            <w:r>
+              <w:rPr>
+                <w:rFonts w:ascii="Arial" w:hAnsi="Arial"/>
+                <w:b w:val="0"/>
+                <w:sz w:val="14"/>
+              </w:rPr>
+              <w:t>-0.25</w:t>
             </w:r>
           </w:p>
         </w:tc>
@@ -3130,7 +3130,7 @@
                 <w:b w:val="0"/>
                 <w:sz w:val="14"/>
               </w:rPr>
-              <w:t>2026-11-01T06:00:00-06:00</w:t>
+              <w:t>2026-10-31T06:00:00-06:00</w:t>
             </w:r>
           </w:p>
         </w:tc>
@@ -3177,21 +3177,6 @@
                 <w:b w:val="0"/>
                 <w:sz w:val="14"/>
               </w:rPr>
-              <w:t>s/d</w:t>
-            </w:r>
-          </w:p>
-        </w:tc>
-        <w:tc>
-          <w:tcPr>
-            <w:tcW w:type="dxa" w:w="1818"/>
-          </w:tcPr>
-          <w:p>
-            <w:r>
-              <w:rPr>
-                <w:rFonts w:ascii="Arial" w:hAnsi="Arial"/>
-                <w:b w:val="0"/>
-                <w:sz w:val="14"/>
-              </w:rPr>
               <w:t>-0.03</w:t>
             </w:r>
           </w:p>
@@ -3208,6 +3193,21 @@
                 <w:sz w:val="14"/>
               </w:rPr>
               <w:t>-0.06</w:t>
+            </w:r>
+          </w:p>
+        </w:tc>
+        <w:tc>
+          <w:tcPr>
+            <w:tcW w:type="dxa" w:w="1818"/>
+          </w:tcPr>
+          <w:p>
+            <w:r>
+              <w:rPr>
+                <w:rFonts w:ascii="Arial" w:hAnsi="Arial"/>
+                <w:b w:val="0"/>
+                <w:sz w:val="14"/>
+              </w:rPr>
+              <w:t>-0.18</w:t>
             </w:r>
           </w:p>
         </w:tc>
@@ -3252,7 +3252,7 @@
                 <w:b w:val="0"/>
                 <w:sz w:val="14"/>
               </w:rPr>
-              <w:t>2026-11-01T06:00:00-06:00</w:t>
+              <w:t>2026-10-31T06:00:00-06:00</w:t>
             </w:r>
           </w:p>
         </w:tc>
@@ -3299,21 +3299,6 @@
                 <w:b w:val="0"/>
                 <w:sz w:val="14"/>
               </w:rPr>
-              <w:t>s/d</w:t>
-            </w:r>
-          </w:p>
-        </w:tc>
-        <w:tc>
-          <w:tcPr>
-            <w:tcW w:type="dxa" w:w="1818"/>
-          </w:tcPr>
-          <w:p>
-            <w:r>
-              <w:rPr>
-                <w:rFonts w:ascii="Arial" w:hAnsi="Arial"/>
-                <w:b w:val="0"/>
-                <w:sz w:val="14"/>
-              </w:rPr>
               <w:t>-0.01</w:t>
             </w:r>
           </w:p>
@@ -3330,6 +3315,21 @@
                 <w:sz w:val="14"/>
               </w:rPr>
               <w:t>-0.03</w:t>
+            </w:r>
+          </w:p>
+        </w:tc>
+        <w:tc>
+          <w:tcPr>
+            <w:tcW w:type="dxa" w:w="1818"/>
+          </w:tcPr>
+          <w:p>
+            <w:r>
+              <w:rPr>
+                <w:rFonts w:ascii="Arial" w:hAnsi="Arial"/>
+                <w:b w:val="0"/>
+                <w:sz w:val="14"/>
+              </w:rPr>
+              <w:t>-0.06</w:t>
             </w:r>
           </w:p>
         </w:tc>
@@ -3374,7 +3374,7 @@
                 <w:b w:val="0"/>
                 <w:sz w:val="14"/>
               </w:rPr>
-              <w:t>2026-11-01T06:00:00-06:00</w:t>
+              <w:t>2026-10-31T06:00:00-06:00</w:t>
             </w:r>
           </w:p>
         </w:tc>
@@ -3421,21 +3421,6 @@
                 <w:b w:val="0"/>
                 <w:sz w:val="14"/>
               </w:rPr>
-              <w:t>s/d</w:t>
-            </w:r>
-          </w:p>
-        </w:tc>
-        <w:tc>
-          <w:tcPr>
-            <w:tcW w:type="dxa" w:w="1818"/>
-          </w:tcPr>
-          <w:p>
-            <w:r>
-              <w:rPr>
-                <w:rFonts w:ascii="Arial" w:hAnsi="Arial"/>
-                <w:b w:val="0"/>
-                <w:sz w:val="14"/>
-              </w:rPr>
               <w:t>-0.04</w:t>
             </w:r>
           </w:p>
@@ -3452,6 +3437,21 @@
                 <w:sz w:val="14"/>
               </w:rPr>
               <w:t>-0.14</w:t>
+            </w:r>
+          </w:p>
+        </w:tc>
+        <w:tc>
+          <w:tcPr>
+            <w:tcW w:type="dxa" w:w="1818"/>
+          </w:tcPr>
+          <w:p>
+            <w:r>
+              <w:rPr>
+                <w:rFonts w:ascii="Arial" w:hAnsi="Arial"/>
+                <w:b w:val="0"/>
+                <w:sz w:val="14"/>
+              </w:rPr>
+              <w:t>-0.20</w:t>
             </w:r>
           </w:p>
         </w:tc>
@@ -3496,7 +3496,7 @@
                 <w:b w:val="0"/>
                 <w:sz w:val="14"/>
               </w:rPr>
-              <w:t>2026-11-01T06:00:00-06:00</w:t>
+              <w:t>2026-10-31T06:00:00-06:00</w:t>
             </w:r>
           </w:p>
         </w:tc>
@@ -3543,21 +3543,6 @@
                 <w:b w:val="0"/>
                 <w:sz w:val="14"/>
               </w:rPr>
-              <w:t>s/d</w:t>
-            </w:r>
-          </w:p>
-        </w:tc>
-        <w:tc>
-          <w:tcPr>
-            <w:tcW w:type="dxa" w:w="1818"/>
-          </w:tcPr>
-          <w:p>
-            <w:r>
-              <w:rPr>
-                <w:rFonts w:ascii="Arial" w:hAnsi="Arial"/>
-                <w:b w:val="0"/>
-                <w:sz w:val="14"/>
-              </w:rPr>
               <w:t>-0.14</w:t>
             </w:r>
           </w:p>
@@ -3574,6 +3559,21 @@
                 <w:sz w:val="14"/>
               </w:rPr>
               <w:t>-0.32</w:t>
+            </w:r>
+          </w:p>
+        </w:tc>
+        <w:tc>
+          <w:tcPr>
+            <w:tcW w:type="dxa" w:w="1818"/>
+          </w:tcPr>
+          <w:p>
+            <w:r>
+              <w:rPr>
+                <w:rFonts w:ascii="Arial" w:hAnsi="Arial"/>
+                <w:b w:val="0"/>
+                <w:sz w:val="14"/>
+              </w:rPr>
+              <w:t>-0.54</w:t>
             </w:r>
           </w:p>
         </w:tc>
@@ -3618,7 +3618,7 @@
                 <w:b w:val="0"/>
                 <w:sz w:val="14"/>
               </w:rPr>
-              <w:t>2026-11-01T06:00:00-06:00</w:t>
+              <w:t>2026-10-31T06:00:00-06:00</w:t>
             </w:r>
           </w:p>
         </w:tc>
@@ -3680,7 +3680,7 @@
                 <w:b w:val="0"/>
                 <w:sz w:val="14"/>
               </w:rPr>
-              <w:t>s/d</w:t>
+              <w:t>-0.89</w:t>
             </w:r>
           </w:p>
         </w:tc>
@@ -3695,7 +3695,7 @@
                 <w:b w:val="0"/>
                 <w:sz w:val="14"/>
               </w:rPr>
-              <w:t>-0.89</w:t>
+              <w:t>-0.95</w:t>
             </w:r>
           </w:p>
         </w:tc>
@@ -3740,7 +3740,7 @@
                 <w:b w:val="0"/>
                 <w:sz w:val="14"/>
               </w:rPr>
-              <w:t>2026-11-01T06:00:00-06:00</w:t>
+              <w:t>2026-10-31T06:00:00-06:00</w:t>
             </w:r>
           </w:p>
         </w:tc>
@@ -3802,7 +3802,7 @@
                 <w:b w:val="0"/>
                 <w:sz w:val="14"/>
               </w:rPr>
-              <w:t>s/d</w:t>
+              <w:t>-0.89</w:t>
             </w:r>
           </w:p>
         </w:tc>
@@ -3817,7 +3817,7 @@
                 <w:b w:val="0"/>
                 <w:sz w:val="14"/>
               </w:rPr>
-              <w:t>-0.89</w:t>
+              <w:t>-0.95</w:t>
             </w:r>
           </w:p>
         </w:tc>
@@ -3862,7 +3862,7 @@
                 <w:b w:val="0"/>
                 <w:sz w:val="14"/>
               </w:rPr>
-              <w:t>2026-11-01T06:00:00-06:00</w:t>
+              <w:t>2026-10-31T06:00:00-06:00</w:t>
             </w:r>
           </w:p>
         </w:tc>
@@ -3909,21 +3909,6 @@
                 <w:b w:val="0"/>
                 <w:sz w:val="14"/>
               </w:rPr>
-              <w:t>s/d</w:t>
-            </w:r>
-          </w:p>
-        </w:tc>
-        <w:tc>
-          <w:tcPr>
-            <w:tcW w:type="dxa" w:w="1818"/>
-          </w:tcPr>
-          <w:p>
-            <w:r>
-              <w:rPr>
-                <w:rFonts w:ascii="Arial" w:hAnsi="Arial"/>
-                <w:b w:val="0"/>
-                <w:sz w:val="14"/>
-              </w:rPr>
               <w:t>-0.11</w:t>
             </w:r>
           </w:p>
@@ -3940,6 +3925,21 @@
                 <w:sz w:val="14"/>
               </w:rPr>
               <w:t>-0.36</w:t>
+            </w:r>
+          </w:p>
+        </w:tc>
+        <w:tc>
+          <w:tcPr>
+            <w:tcW w:type="dxa" w:w="1818"/>
+          </w:tcPr>
+          <w:p>
+            <w:r>
+              <w:rPr>
+                <w:rFonts w:ascii="Arial" w:hAnsi="Arial"/>
+                <w:b w:val="0"/>
+                <w:sz w:val="14"/>
+              </w:rPr>
+              <w:t>-0.45</w:t>
             </w:r>
           </w:p>
         </w:tc>
@@ -3984,7 +3984,7 @@
                 <w:b w:val="0"/>
                 <w:sz w:val="14"/>
               </w:rPr>
-              <w:t>2026-11-01T06:00:00-06:00</w:t>
+              <w:t>2026-10-31T06:00:00-06:00</w:t>
             </w:r>
           </w:p>
         </w:tc>
@@ -4031,21 +4031,6 @@
                 <w:b w:val="0"/>
                 <w:sz w:val="14"/>
               </w:rPr>
-              <w:t>s/d</w:t>
-            </w:r>
-          </w:p>
-        </w:tc>
-        <w:tc>
-          <w:tcPr>
-            <w:tcW w:type="dxa" w:w="1818"/>
-          </w:tcPr>
-          <w:p>
-            <w:r>
-              <w:rPr>
-                <w:rFonts w:ascii="Arial" w:hAnsi="Arial"/>
-                <w:b w:val="0"/>
-                <w:sz w:val="14"/>
-              </w:rPr>
               <w:t>-0.12</w:t>
             </w:r>
           </w:p>
@@ -4062,6 +4047,21 @@
                 <w:sz w:val="14"/>
               </w:rPr>
               <w:t>-0.28</w:t>
+            </w:r>
+          </w:p>
+        </w:tc>
+        <w:tc>
+          <w:tcPr>
+            <w:tcW w:type="dxa" w:w="1818"/>
+          </w:tcPr>
+          <w:p>
+            <w:r>
+              <w:rPr>
+                <w:rFonts w:ascii="Arial" w:hAnsi="Arial"/>
+                <w:b w:val="0"/>
+                <w:sz w:val="14"/>
+              </w:rPr>
+              <w:t>-0.52</w:t>
             </w:r>
           </w:p>
         </w:tc>
@@ -4106,7 +4106,7 @@
                 <w:b w:val="0"/>
                 <w:sz w:val="14"/>
               </w:rPr>
-              <w:t>2026-11-01T06:00:00-06:00</w:t>
+              <w:t>2026-10-31T06:00:00-06:00</w:t>
             </w:r>
           </w:p>
         </w:tc>
@@ -4153,21 +4153,6 @@
                 <w:b w:val="0"/>
                 <w:sz w:val="14"/>
               </w:rPr>
-              <w:t>s/d</w:t>
-            </w:r>
-          </w:p>
-        </w:tc>
-        <w:tc>
-          <w:tcPr>
-            <w:tcW w:type="dxa" w:w="1818"/>
-          </w:tcPr>
-          <w:p>
-            <w:r>
-              <w:rPr>
-                <w:rFonts w:ascii="Arial" w:hAnsi="Arial"/>
-                <w:b w:val="0"/>
-                <w:sz w:val="14"/>
-              </w:rPr>
               <w:t>-0.17</w:t>
             </w:r>
           </w:p>
@@ -4184,6 +4169,21 @@
                 <w:sz w:val="14"/>
               </w:rPr>
               <w:t>-0.36</w:t>
+            </w:r>
+          </w:p>
+        </w:tc>
+        <w:tc>
+          <w:tcPr>
+            <w:tcW w:type="dxa" w:w="1818"/>
+          </w:tcPr>
+          <w:p>
+            <w:r>
+              <w:rPr>
+                <w:rFonts w:ascii="Arial" w:hAnsi="Arial"/>
+                <w:b w:val="0"/>
+                <w:sz w:val="14"/>
+              </w:rPr>
+              <w:t>-0.69</w:t>
             </w:r>
           </w:p>
         </w:tc>
@@ -4228,7 +4228,7 @@
                 <w:b w:val="0"/>
                 <w:sz w:val="14"/>
               </w:rPr>
-              <w:t>2026-11-01T06:00:00-06:00</w:t>
+              <w:t>2026-10-31T06:00:00-06:00</w:t>
             </w:r>
           </w:p>
         </w:tc>
@@ -4275,7 +4275,7 @@
                 <w:b w:val="0"/>
                 <w:sz w:val="14"/>
               </w:rPr>
-              <w:t>s/d</w:t>
+              <w:t>+0.00</w:t>
             </w:r>
           </w:p>
         </w:tc>
@@ -4350,7 +4350,7 @@
                 <w:b w:val="0"/>
                 <w:sz w:val="14"/>
               </w:rPr>
-              <w:t>2026-11-01T06:00:00-06:00</w:t>
+              <w:t>2026-10-31T06:00:00-06:00</w:t>
             </w:r>
           </w:p>
         </w:tc>
@@ -4397,21 +4397,6 @@
                 <w:b w:val="0"/>
                 <w:sz w:val="14"/>
               </w:rPr>
-              <w:t>s/d</w:t>
-            </w:r>
-          </w:p>
-        </w:tc>
-        <w:tc>
-          <w:tcPr>
-            <w:tcW w:type="dxa" w:w="1818"/>
-          </w:tcPr>
-          <w:p>
-            <w:r>
-              <w:rPr>
-                <w:rFonts w:ascii="Arial" w:hAnsi="Arial"/>
-                <w:b w:val="0"/>
-                <w:sz w:val="14"/>
-              </w:rPr>
               <w:t>-0.59</w:t>
             </w:r>
           </w:p>
@@ -4428,6 +4413,21 @@
                 <w:sz w:val="14"/>
               </w:rPr>
               <w:t>-1.07</w:t>
+            </w:r>
+          </w:p>
+        </w:tc>
+        <w:tc>
+          <w:tcPr>
+            <w:tcW w:type="dxa" w:w="1818"/>
+          </w:tcPr>
+          <w:p>
+            <w:r>
+              <w:rPr>
+                <w:rFonts w:ascii="Arial" w:hAnsi="Arial"/>
+                <w:b w:val="0"/>
+                <w:sz w:val="14"/>
+              </w:rPr>
+              <w:t>-1.68</w:t>
             </w:r>
           </w:p>
         </w:tc>
@@ -4472,7 +4472,7 @@
                 <w:b w:val="0"/>
                 <w:sz w:val="14"/>
               </w:rPr>
-              <w:t>2026-11-01T06:00:00-06:00</w:t>
+              <w:t>2026-10-31T06:00:00-06:00</w:t>
             </w:r>
           </w:p>
         </w:tc>

</xml_diff>